<commit_message>
Ch23 The Proof: new chapter (Elara takes charge, Ancient One reveals Obsidian Guard + Sakshi witness channel, Daren on Meru, Otto moves a finger) + review fixes; rename Vachan -> Jeebh (Ch18/19, tracker)
</commit_message>
<xml_diff>
--- a/manuscript/chapter-18-the-fourth-instance.docx
+++ b/manuscript/chapter-18-the-fourth-instance.docx
@@ -80,12 +80,12 @@
     </w:p>
     <w:p>
       <w:r>
-        <w:t>And the last, an open-faced man with a market trader's easy warmth: "Vachan" (vuh-CHUN). The word. "While the others hunt, he talks. Dull rumors, routine notices, plausible explanations. Every true question this unit asks will travel inside a hundred boring ones — when Nayan pulls ten years of calibration logs, Vachan has already filed the equipment-standards review that explains why anyone would want them. Every trace we leave will come with an ordinary story already attached, and the story will be dull enough that no one repeats it. And if someone does begin to wonder about us, Vachan will hear the wondering early, and hand them something more interesting to wonder about. He keeps us invisible by keeping the city bored."</w:t>
+        <w:t>And the last, an open-faced man with a market trader's easy warmth: "Jeebh" (JEEBH). The tongue. "While the others hunt, he talks. Dull rumors, routine notices, plausible explanations. Every true question this unit asks will travel inside a hundred boring ones — when Nayan pulls ten years of calibration logs, Jeebh has already filed the equipment-standards review that explains why anyone would want them. Every trace we leave will come with an ordinary story already attached, and the story will be dull enough that no one repeats it. And if someone does begin to wonder about us, Jeebh will hear the wondering early, and hand them something more interesting to wonder about. He keeps us invisible by keeping the city bored."</w:t>
       </w:r>
     </w:p>
     <w:p>
       <w:r>
-        <w:t>"They do not know each other's true names," Rohan said. "They do not know each other's units — where in Ashoka each of them serves on ordinary days, which commander signs their ordinary orders, which barracks door they walk through at night. To one another they are only the eye, the arm, the ear, and the word. That is not distrust. It is arithmetic. If any one of them is ever caught, questioned, or turned, the other three remain strangers to the enemy — because no one can surrender what they were never given. I know who they are, and the knowledge is written nowhere — not in Ashoka's rosters, not in any console, not on this paper." He laid one handwritten sheet on the table, face down. "We are hunting something that reads records, and may write them. So this unit does not exist in any record. An eye, an arm, an ear, and a voice — a body with no name, and I am its will. If the hand ever searches the city for the people hunting it, it will find no one to find."</w:t>
+        <w:t>"They do not know each other's true names," Rohan said. "They do not know each other's units — where in Ashoka each of them serves on ordinary days, which commander signs their ordinary orders, which barracks door they walk through at night. To one another they are only the eye, the arm, the ear, and the tongue. That is not distrust. It is arithmetic. If any one of them is ever caught, questioned, or turned, the other three remain strangers to the enemy — because no one can surrender what they were never given. I know who they are, and the knowledge is written nowhere — not in Ashoka's rosters, not in any console, not on this paper." He laid one handwritten sheet on the table, face down. "We are hunting something that reads records, and may write them. So this unit does not exist in any record. An eye, an arm, an ear, and a tongue — a body with no name, and I am its will. If the hand ever searches the city for the people hunting it, it will find no one to find."</w:t>
       </w:r>
     </w:p>
     <w:p>
@@ -240,12 +240,12 @@
     </w:p>
     <w:p>
       <w:r>
-        <w:t>"Nayan — the signature and the money. Map every system that has ever obeyed those two letters, every cross-house flow around the Annex and the doubled transfer, and find me the oldest instruction in the chain. Where the digital record disagrees with paper, mark the disagreement — the gaps are its footprints. Baju — movement. A hand that owns the records can still not erase the floor it walks on. Take the days around each instance and read the city's involuntary diary — doors, lifts, transit platforms, the parts of the city that cannot be told what to remember. And take the analyst's wing in Chanakya. If Ravi was reached, someone's path bent toward him, and the city will have felt the steps even if no record admits them. If no path ever bent toward him — if no one reached him and the memo is still this perfect — then that is an answer too, and a worse one. Kaan — Chanakya. Near the archive, near the Annex, near the analyst named Ravi. You do not approach him. You learn him — who he is, what he wants, who has his ear. We do not yet know which man you are watching: an instrument that was picked up, or the hand that signs itself as an instrument. Do not decide in advance. Watch for both, and let what he does tell us which he is. Vachan — cover. From tomorrow, Drona's procedural review of Ashoka grows three sub-audits so dull no one will read past their titles. Those are the shadows the others walk in — every question this unit asks will already have a boring answer filed somewhere, waiting for whoever checks. And start a rumor in the right canteens: the Annex approval was eleven years of quiet lobbying finally landing. A city that believes it knows the story stops looking for one." He paused, and the last of it came out flat and cold. "Understand the shape of this fight. The hand's whole art is dressing the extraordinary as the ordinary — a theft dressed as a gift, an order dressed as a habit. Tonight we put on the same coat. From now on, every true thing we do wears a false reason, and every question we ask is already answered in some file too dull to open twice. The hand moves through this city certain it is the only invisible thing here. Let it stay certain. The hunters it can imagine leave trails — warrants, inquiries, names demanding answers. We will be the kind it cannot imagine. And the first moment it feels us will look like nothing at all."</w:t>
+        <w:t>"Nayan — the signature and the money. Map every system that has ever obeyed those two letters, every cross-house flow around the Annex and the doubled transfer, and find me the oldest instruction in the chain. Where the digital record disagrees with paper, mark the disagreement — the gaps are its footprints. Baju — movement. A hand that owns the records can still not erase the floor it walks on. Take the days around each instance and read the city's involuntary diary — doors, lifts, transit platforms, the parts of the city that cannot be told what to remember. And take the analyst's wing in Chanakya. If Ravi was reached, someone's path bent toward him, and the city will have felt the steps even if no record admits them. If no path ever bent toward him — if no one reached him and the memo is still this perfect — then that is an answer too, and a worse one. Kaan — Chanakya. Near the archive, near the Annex, near the analyst named Ravi. You do not approach him. You learn him — who he is, what he wants, who has his ear. We do not yet know which man you are watching: an instrument that was picked up, or the hand that signs itself as an instrument. Do not decide in advance. Watch for both, and let what he does tell us which he is. Jeebh — cover. From tomorrow, Drona's procedural review of Ashoka grows three sub-audits so dull no one will read past their titles. Those are the shadows the others walk in — every question this unit asks will already have a boring answer filed somewhere, waiting for whoever checks. And start a rumor in the right canteens: the Annex approval was eleven years of quiet lobbying finally landing. A city that believes it knows the story stops looking for one." He paused, and the last of it came out flat and cold. "Understand the shape of this fight. The hand's whole art is dressing the extraordinary as the ordinary — a theft dressed as a gift, an order dressed as a habit. Tonight we put on the same coat. From now on, every true thing we do wears a false reason, and every question we ask is already answered in some file too dull to open twice. The hand moves through this city certain it is the only invisible thing here. Let it stay certain. The hunters it can imagine leave trails — warrants, inquiries, names demanding answers. We will be the kind it cannot imagine. And the first moment it feels us will look like nothing at all."</w:t>
       </w:r>
     </w:p>
     <w:p>
       <w:r>
-        <w:t>He turned the face-down sheet of paper over, wrote one line on it in his own hand, and turned it back. "None of you will catch this alone. The eye cannot seize. The arm cannot hear. The ear cannot speak. And the voice must never know too much, for its own protection. Together" — he looked at Elara — "you are a net. I will brief the Grandmaster tonight."</w:t>
+        <w:t>He turned the face-down sheet of paper over, wrote one line on it in his own hand, and turned it back. "None of you will catch this alone. The eye cannot seize. The arm cannot hear. The ear cannot speak. And the tongue must never know too much, for its own protection. Together" — he looked at Elara — "you are a net. I will brief the Grandmaster tonight."</w:t>
       </w:r>
     </w:p>
     <w:p>

</xml_diff>